<commit_message>
change razdel 1 and 2
</commit_message>
<xml_diff>
--- a/Димплом_2.docx
+++ b/Димплом_2.docx
@@ -4048,197 +4048,41 @@
     <w:p>
       <w:pPr>
         <w:pStyle w:val="af3"/>
-        <w:rPr>
-          <w:lang w:eastAsia="ru-RU"/>
-        </w:rPr>
-      </w:pPr>
-      <w:r>
-        <w:rPr>
-          <w:b/>
-          <w:bCs/>
-          <w:lang w:eastAsia="ru-RU"/>
-        </w:rPr>
-        <w:t>Состав работы:</w:t>
-      </w:r>
-      <w:r>
-        <w:rPr>
-          <w:lang w:eastAsia="ru-RU"/>
-        </w:rPr>
-        <w:t> пояснительная записка содержит 6 разделов, {{N}} страниц, {{N}} рисунков, {{N}} таблиц, {{N}} приложений, 2</w:t>
-      </w:r>
-      <w:r>
-        <w:rPr>
-          <w:lang w:eastAsia="ru-RU"/>
-        </w:rPr>
-        <w:t>8</w:t>
-      </w:r>
-      <w:r>
-        <w:rPr>
-          <w:lang w:eastAsia="ru-RU"/>
-        </w:rPr>
-        <w:t xml:space="preserve"> источников.</w:t>
+      </w:pPr>
+      <w:r>
+        <w:t>Состав работы: пояснительная записка содержит 6 разделов, {{N}} страниц, {{N}} рисунков, {{N}} таблиц, {{N}} приложений, 28 источников.</w:t>
       </w:r>
     </w:p>
     <w:p>
       <w:pPr>
         <w:pStyle w:val="af3"/>
-        <w:rPr>
-          <w:lang w:eastAsia="ru-RU"/>
-        </w:rPr>
-      </w:pPr>
-      <w:r>
-        <w:rPr>
-          <w:lang w:eastAsia="ru-RU"/>
-        </w:rPr>
-        <w:t>Настоящая выпускная квалификационная работа посвящена проектированию и разработке информационной системы для учёта и планирования силовых спортивных тренировок. Разработанная система — приложение FitApp — реализована в виде кроссплатформенного мобильного и десктопного клиента на платформе .NET MAUI 9, с серверной частью на ASP.NET Core 9 и облачной базой данных PostgreSQL.</w:t>
+      </w:pPr>
+      <w:r>
+        <w:t>Выпускная квалификационная работа посвящена проектированию и разработке информационной системы для учёта и планирования силовых тренировок — приложения FitApp. Система реализована как кроссплатформенный клиент на платформе .NET MAUI 9 (Android, Windows) с серверной частью на ASP.NET Core 9 и облачной базой данных PostgreSQL; она сохраняет полную функциональность в автономном режиме.</w:t>
       </w:r>
     </w:p>
     <w:p>
       <w:pPr>
         <w:pStyle w:val="af3"/>
-        <w:rPr>
-          <w:lang w:eastAsia="ru-RU"/>
-        </w:rPr>
-      </w:pPr>
-      <w:r>
-        <w:rPr>
-          <w:b/>
-          <w:bCs/>
-          <w:lang w:eastAsia="ru-RU"/>
-        </w:rPr>
-        <w:t>Объект исследования</w:t>
-      </w:r>
-      <w:r>
-        <w:rPr>
-          <w:lang w:eastAsia="ru-RU"/>
-        </w:rPr>
-        <w:t> — процессы учёта, анализа и планирования силовых тренировок в условиях неограниченного доступа к персональному мобильному устройству.</w:t>
+      </w:pPr>
+      <w:r>
+        <w:t>В работе обоснован выбор технологического стека и спроектирована архитектура клиента, серверной части и базы данных. Центральным элементом системы является модуль прогнозирования одноповторного максимума на горизонте 28 дней: на синтетическом наборе данных обучена модель градиентного бустинга LightGBM, преобразованная в формат ONNX для локального выполнения вывода на устройстве. На основе прогноза реализован алгоритм планирования нагрузки на следующую тренировку. Двунаправленная облачная синхронизация данных между устройствами выполнена по стратегии «последняя запись побеждает».</w:t>
       </w:r>
     </w:p>
     <w:p>
       <w:pPr>
         <w:pStyle w:val="af3"/>
-        <w:rPr>
-          <w:lang w:eastAsia="ru-RU"/>
-        </w:rPr>
-      </w:pPr>
-      <w:r>
-        <w:rPr>
-          <w:b/>
-          <w:bCs/>
-          <w:lang w:eastAsia="ru-RU"/>
-        </w:rPr>
-        <w:t>Предмет исследования</w:t>
-      </w:r>
-      <w:r>
-        <w:rPr>
-          <w:lang w:eastAsia="ru-RU"/>
-        </w:rPr>
-        <w:t> — методы и инструментальные средства построения кроссплатформенной информационной системы с модулем машинного обучения для прогнозирования силовых показателей и генерации тренировочных рекомендаций.</w:t>
+      </w:pPr>
+      <w:r>
+        <w:t>Практическая значимость работы состоит в создании готового к использованию приложения, объединяющего дневник тренировок, статистику прогресса, интеллектуальное планирование нагрузки и облачную синхронизацию. Приложение протестировано на платформах Android и Windows.</w:t>
       </w:r>
     </w:p>
     <w:p>
       <w:pPr>
         <w:pStyle w:val="af3"/>
-        <w:rPr>
-          <w:lang w:eastAsia="ru-RU"/>
-        </w:rPr>
-      </w:pPr>
-      <w:r>
-        <w:rPr>
-          <w:b/>
-          <w:bCs/>
-          <w:lang w:eastAsia="ru-RU"/>
-        </w:rPr>
-        <w:t>Цель работы</w:t>
-      </w:r>
-      <w:r>
-        <w:rPr>
-          <w:lang w:eastAsia="ru-RU"/>
-        </w:rPr>
-        <w:t> — разработка функционально полной информационной системы для учёта и планирования силовых тренировок, включающей модуль прогнозирования одноповторного максимума на основе градиентного бустинга и облачную синхронизацию данных между устройствами.</w:t>
-      </w:r>
-    </w:p>
-    <w:p>
-      <w:pPr>
-        <w:pStyle w:val="af3"/>
-        <w:rPr>
-          <w:lang w:eastAsia="ru-RU"/>
-        </w:rPr>
-      </w:pPr>
-      <w:r>
-        <w:rPr>
-          <w:b/>
-          <w:bCs/>
-          <w:lang w:eastAsia="ru-RU"/>
-        </w:rPr>
-        <w:t>Методы исследования:</w:t>
-      </w:r>
-      <w:r>
-        <w:rPr>
-          <w:lang w:eastAsia="ru-RU"/>
-        </w:rPr>
-        <w:t> сравнительный анализ аналогов, объектно-ориентированное проектирование, методы машинного обучения (градиентный бустинг, линейная регрессия), параметрическое моделирование, бэктестирование на синтетических данных, интеграционное тестирование распределённой системы.</w:t>
-      </w:r>
-    </w:p>
-    <w:p>
-      <w:pPr>
-        <w:pStyle w:val="af3"/>
-        <w:rPr>
-          <w:lang w:eastAsia="ru-RU"/>
-        </w:rPr>
-      </w:pPr>
-      <w:r>
-        <w:rPr>
-          <w:b/>
-          <w:bCs/>
-          <w:lang w:eastAsia="ru-RU"/>
-        </w:rPr>
-        <w:t>Краткое содержание работы.</w:t>
-      </w:r>
-      <w:r>
-        <w:rPr>
-          <w:lang w:eastAsia="ru-RU"/>
-        </w:rPr>
-        <w:t xml:space="preserve"> В ходе выполнения работы проведён анализ существующих приложений для учёта тренировок и обоснована необходимость разработки собственного решения с интегрированным модулем прогнозирования. Спроектирована и реализована </w:t>
-      </w:r>
-      <w:r>
-        <w:rPr>
-          <w:lang w:eastAsia="ru-RU"/>
-        </w:rPr>
-        <w:lastRenderedPageBreak/>
-        <w:t xml:space="preserve">кроссплатформенная архитектура на базе .NET MAUI 9 с паттерном MVVM, локальной базой данных SQLite и офлайн-первым подходом. Разработан синтетический датасет из 763 322 подходов 500 виртуальных атлетов за 26 недель, на котором обучена модель LightGBM для прогнозирования одноповторного максимума (1ПМ) на горизонте 28 дней. Модель достигает средней абсолютной ошибки 1,437 кг, что на 39% ниже наивного предиктора. Для локального </w:t>
-      </w:r>
-      <w:r>
-        <w:t>выполнения</w:t>
-      </w:r>
-      <w:r>
-        <w:rPr>
-          <w:lang w:eastAsia="ru-RU"/>
-        </w:rPr>
-        <w:t xml:space="preserve"> вывода модель конвертирована в формат ONNX и встроена в приложение без зависимости от внешних серверов. Разработан алгоритм планирования следующей тренировки, прошедший валидацию на 12 631 рекомендации. Реализован сервер с двунаправленной синхронизацией данных по стратегии Last-Write-Wins с постоянным хранилищем PostgreSQL.</w:t>
-      </w:r>
-    </w:p>
-    <w:p>
-      <w:pPr>
-        <w:pStyle w:val="af3"/>
-      </w:pPr>
-      <w:r>
-        <w:t>Практическая значимость состоит в создании работоспособного кроссплатформенного приложения, объединяющего дневник тренировок, статистику прогресса, интеллектуальное планирование нагрузки и облачную синхронизацию. Приложение протестировано на платформах Android и Windows.</w:t>
-      </w:r>
-    </w:p>
-    <w:p>
-      <w:pPr>
-        <w:pStyle w:val="af3"/>
-        <w:rPr>
-          <w:lang w:eastAsia="ru-RU"/>
-        </w:rPr>
-      </w:pPr>
-      <w:r>
-        <w:t>Ключевые слова: информационная система, мобильное приложение, .NET MAUI, силовые тренировки, машинное обучение, LightGBM, ONNX, прогнозирование одноповторного максимума, облачная синхронизация, Last-Write-Wins.</w:t>
-      </w:r>
-      <w:r>
-        <w:t xml:space="preserve">  </w:t>
+      </w:pPr>
+      <w:r>
+        <w:t>Ключевые слова: информационная система, кроссплатформенное приложение, .NET MAUI, силовые тренировки, машинное обучение, LightGBM, ONNX, прогнозирование одноповторного максимума, облачная синхронизация.</w:t>
       </w:r>
       <w:r>
         <w:br/>
@@ -4285,8 +4129,8 @@
         <w:tblLook w:val="04A0" w:firstRow="1" w:lastRow="0" w:firstColumn="1" w:lastColumn="0" w:noHBand="0" w:noVBand="1"/>
       </w:tblPr>
       <w:tblGrid>
-        <w:gridCol w:w="1997"/>
-        <w:gridCol w:w="7342"/>
+        <w:gridCol w:w="1768"/>
+        <w:gridCol w:w="7571"/>
       </w:tblGrid>
       <w:tr>
         <w:trPr>
@@ -4317,6 +4161,8 @@
               <w:rPr>
                 <w:b/>
                 <w:bCs/>
+                <w:sz w:val="24"/>
+                <w:szCs w:val="20"/>
                 <w:lang w:val="ru-RU"/>
               </w:rPr>
             </w:pPr>
@@ -4324,6 +4170,8 @@
               <w:rPr>
                 <w:b/>
                 <w:bCs/>
+                <w:sz w:val="24"/>
+                <w:szCs w:val="20"/>
                 <w:lang w:val="ru-RU"/>
               </w:rPr>
               <w:t>Сокращение</w:t>
@@ -4355,6 +4203,8 @@
               <w:rPr>
                 <w:b/>
                 <w:bCs/>
+                <w:sz w:val="24"/>
+                <w:szCs w:val="20"/>
                 <w:lang w:val="ru-RU"/>
               </w:rPr>
             </w:pPr>
@@ -4362,6 +4212,8 @@
               <w:rPr>
                 <w:b/>
                 <w:bCs/>
+                <w:sz w:val="24"/>
+                <w:szCs w:val="20"/>
                 <w:lang w:val="ru-RU"/>
               </w:rPr>
               <w:t>Расшифровка</w:t>
@@ -4393,11 +4245,15 @@
             <w:pPr>
               <w:ind w:firstLine="0"/>
               <w:rPr>
-                <w:lang w:val="ru-RU"/>
-              </w:rPr>
-            </w:pPr>
-            <w:r>
-              <w:rPr>
+                <w:sz w:val="24"/>
+                <w:szCs w:val="20"/>
+                <w:lang w:val="ru-RU"/>
+              </w:rPr>
+            </w:pPr>
+            <w:r>
+              <w:rPr>
+                <w:sz w:val="24"/>
+                <w:szCs w:val="20"/>
                 <w:lang w:val="ru-RU"/>
               </w:rPr>
               <w:t>1ПМ</w:t>
@@ -4427,11 +4283,15 @@
             <w:pPr>
               <w:ind w:firstLine="0"/>
               <w:rPr>
-                <w:lang w:val="ru-RU"/>
-              </w:rPr>
-            </w:pPr>
-            <w:r>
-              <w:rPr>
+                <w:sz w:val="24"/>
+                <w:szCs w:val="20"/>
+                <w:lang w:val="ru-RU"/>
+              </w:rPr>
+            </w:pPr>
+            <w:r>
+              <w:rPr>
+                <w:sz w:val="24"/>
+                <w:szCs w:val="20"/>
                 <w:lang w:val="ru-RU"/>
               </w:rPr>
               <w:t>Одноповторный максимум (one-rep max, 1RM)</w:t>
@@ -4463,11 +4323,15 @@
             <w:pPr>
               <w:ind w:firstLine="0"/>
               <w:rPr>
-                <w:lang w:val="ru-RU"/>
-              </w:rPr>
-            </w:pPr>
-            <w:r>
-              <w:rPr>
+                <w:sz w:val="24"/>
+                <w:szCs w:val="20"/>
+                <w:lang w:val="ru-RU"/>
+              </w:rPr>
+            </w:pPr>
+            <w:r>
+              <w:rPr>
+                <w:sz w:val="24"/>
+                <w:szCs w:val="20"/>
                 <w:lang w:val="ru-RU"/>
               </w:rPr>
               <w:t>API</w:t>
@@ -4496,30 +4360,52 @@
           <w:p>
             <w:pPr>
               <w:ind w:firstLine="0"/>
-            </w:pPr>
-            <w:r>
+              <w:rPr>
+                <w:sz w:val="24"/>
+                <w:szCs w:val="20"/>
+              </w:rPr>
+            </w:pPr>
+            <w:r>
+              <w:rPr>
+                <w:sz w:val="24"/>
+                <w:szCs w:val="20"/>
+              </w:rPr>
               <w:t xml:space="preserve">Application Programming Interface — </w:t>
             </w:r>
             <w:r>
               <w:rPr>
+                <w:sz w:val="24"/>
+                <w:szCs w:val="20"/>
                 <w:lang w:val="ru-RU"/>
               </w:rPr>
               <w:t>интерфейс</w:t>
             </w:r>
             <w:r>
+              <w:rPr>
+                <w:sz w:val="24"/>
+                <w:szCs w:val="20"/>
+              </w:rPr>
               <w:t xml:space="preserve"> </w:t>
             </w:r>
             <w:r>
               <w:rPr>
+                <w:sz w:val="24"/>
+                <w:szCs w:val="20"/>
                 <w:lang w:val="ru-RU"/>
               </w:rPr>
               <w:t>программного</w:t>
             </w:r>
             <w:r>
+              <w:rPr>
+                <w:sz w:val="24"/>
+                <w:szCs w:val="20"/>
+              </w:rPr>
               <w:t xml:space="preserve"> </w:t>
             </w:r>
             <w:r>
               <w:rPr>
+                <w:sz w:val="24"/>
+                <w:szCs w:val="20"/>
                 <w:lang w:val="ru-RU"/>
               </w:rPr>
               <w:t>взаимодействия</w:t>
@@ -4551,11 +4437,15 @@
             <w:pPr>
               <w:ind w:firstLine="0"/>
               <w:rPr>
-                <w:lang w:val="ru-RU"/>
-              </w:rPr>
-            </w:pPr>
-            <w:r>
-              <w:rPr>
+                <w:sz w:val="24"/>
+                <w:szCs w:val="20"/>
+                <w:lang w:val="ru-RU"/>
+              </w:rPr>
+            </w:pPr>
+            <w:r>
+              <w:rPr>
+                <w:sz w:val="24"/>
+                <w:szCs w:val="20"/>
                 <w:lang w:val="ru-RU"/>
               </w:rPr>
               <w:t>БД</w:t>
@@ -4585,11 +4475,15 @@
             <w:pPr>
               <w:ind w:firstLine="0"/>
               <w:rPr>
-                <w:lang w:val="ru-RU"/>
-              </w:rPr>
-            </w:pPr>
-            <w:r>
-              <w:rPr>
+                <w:sz w:val="24"/>
+                <w:szCs w:val="20"/>
+                <w:lang w:val="ru-RU"/>
+              </w:rPr>
+            </w:pPr>
+            <w:r>
+              <w:rPr>
+                <w:sz w:val="24"/>
+                <w:szCs w:val="20"/>
                 <w:lang w:val="ru-RU"/>
               </w:rPr>
               <w:t>База данных</w:t>
@@ -4621,11 +4515,15 @@
             <w:pPr>
               <w:ind w:firstLine="0"/>
               <w:rPr>
-                <w:lang w:val="ru-RU"/>
-              </w:rPr>
-            </w:pPr>
-            <w:r>
-              <w:rPr>
+                <w:sz w:val="24"/>
+                <w:szCs w:val="20"/>
+                <w:lang w:val="ru-RU"/>
+              </w:rPr>
+            </w:pPr>
+            <w:r>
+              <w:rPr>
+                <w:sz w:val="24"/>
+                <w:szCs w:val="20"/>
                 <w:lang w:val="ru-RU"/>
               </w:rPr>
               <w:t>DI</w:t>
@@ -4655,11 +4553,15 @@
             <w:pPr>
               <w:ind w:firstLine="0"/>
               <w:rPr>
-                <w:lang w:val="ru-RU"/>
-              </w:rPr>
-            </w:pPr>
-            <w:r>
-              <w:rPr>
+                <w:sz w:val="24"/>
+                <w:szCs w:val="20"/>
+                <w:lang w:val="ru-RU"/>
+              </w:rPr>
+            </w:pPr>
+            <w:r>
+              <w:rPr>
+                <w:sz w:val="24"/>
+                <w:szCs w:val="20"/>
                 <w:lang w:val="ru-RU"/>
               </w:rPr>
               <w:t>Dependency Injection — внедрение зависимостей</w:t>
@@ -4691,11 +4593,15 @@
             <w:pPr>
               <w:ind w:firstLine="0"/>
               <w:rPr>
-                <w:lang w:val="ru-RU"/>
-              </w:rPr>
-            </w:pPr>
-            <w:r>
-              <w:rPr>
+                <w:sz w:val="24"/>
+                <w:szCs w:val="20"/>
+                <w:lang w:val="ru-RU"/>
+              </w:rPr>
+            </w:pPr>
+            <w:r>
+              <w:rPr>
+                <w:sz w:val="24"/>
+                <w:szCs w:val="20"/>
                 <w:lang w:val="ru-RU"/>
               </w:rPr>
               <w:t>GUID</w:t>
@@ -4725,11 +4631,15 @@
             <w:pPr>
               <w:ind w:firstLine="0"/>
               <w:rPr>
-                <w:lang w:val="ru-RU"/>
-              </w:rPr>
-            </w:pPr>
-            <w:r>
-              <w:rPr>
+                <w:sz w:val="24"/>
+                <w:szCs w:val="20"/>
+                <w:lang w:val="ru-RU"/>
+              </w:rPr>
+            </w:pPr>
+            <w:r>
+              <w:rPr>
+                <w:sz w:val="24"/>
+                <w:szCs w:val="20"/>
                 <w:lang w:val="ru-RU"/>
               </w:rPr>
               <w:t>Globally Unique Identifier — глобально уникальный идентификатор</w:t>
@@ -4761,11 +4671,15 @@
             <w:pPr>
               <w:ind w:firstLine="0"/>
               <w:rPr>
-                <w:lang w:val="ru-RU"/>
-              </w:rPr>
-            </w:pPr>
-            <w:r>
-              <w:rPr>
+                <w:sz w:val="24"/>
+                <w:szCs w:val="20"/>
+                <w:lang w:val="ru-RU"/>
+              </w:rPr>
+            </w:pPr>
+            <w:r>
+              <w:rPr>
+                <w:sz w:val="24"/>
+                <w:szCs w:val="20"/>
                 <w:lang w:val="ru-RU"/>
               </w:rPr>
               <w:t>JSON</w:t>
@@ -4794,30 +4708,52 @@
           <w:p>
             <w:pPr>
               <w:ind w:firstLine="0"/>
-            </w:pPr>
-            <w:r>
+              <w:rPr>
+                <w:sz w:val="24"/>
+                <w:szCs w:val="20"/>
+              </w:rPr>
+            </w:pPr>
+            <w:r>
+              <w:rPr>
+                <w:sz w:val="24"/>
+                <w:szCs w:val="20"/>
+              </w:rPr>
               <w:t xml:space="preserve">JavaScript Object Notation — </w:t>
             </w:r>
             <w:r>
               <w:rPr>
+                <w:sz w:val="24"/>
+                <w:szCs w:val="20"/>
                 <w:lang w:val="ru-RU"/>
               </w:rPr>
               <w:t>формат</w:t>
             </w:r>
             <w:r>
+              <w:rPr>
+                <w:sz w:val="24"/>
+                <w:szCs w:val="20"/>
+              </w:rPr>
               <w:t xml:space="preserve"> </w:t>
             </w:r>
             <w:r>
               <w:rPr>
+                <w:sz w:val="24"/>
+                <w:szCs w:val="20"/>
                 <w:lang w:val="ru-RU"/>
               </w:rPr>
               <w:t>обмена</w:t>
             </w:r>
             <w:r>
+              <w:rPr>
+                <w:sz w:val="24"/>
+                <w:szCs w:val="20"/>
+              </w:rPr>
               <w:t xml:space="preserve"> </w:t>
             </w:r>
             <w:r>
               <w:rPr>
+                <w:sz w:val="24"/>
+                <w:szCs w:val="20"/>
                 <w:lang w:val="ru-RU"/>
               </w:rPr>
               <w:t>данными</w:t>
@@ -4849,11 +4785,15 @@
             <w:pPr>
               <w:ind w:firstLine="0"/>
               <w:rPr>
-                <w:lang w:val="ru-RU"/>
-              </w:rPr>
-            </w:pPr>
-            <w:r>
-              <w:rPr>
+                <w:sz w:val="24"/>
+                <w:szCs w:val="20"/>
+                <w:lang w:val="ru-RU"/>
+              </w:rPr>
+            </w:pPr>
+            <w:r>
+              <w:rPr>
+                <w:sz w:val="24"/>
+                <w:szCs w:val="20"/>
                 <w:lang w:val="ru-RU"/>
               </w:rPr>
               <w:t>JWT</w:t>
@@ -4883,11 +4823,15 @@
             <w:pPr>
               <w:ind w:firstLine="0"/>
               <w:rPr>
-                <w:lang w:val="ru-RU"/>
-              </w:rPr>
-            </w:pPr>
-            <w:r>
-              <w:rPr>
+                <w:sz w:val="24"/>
+                <w:szCs w:val="20"/>
+                <w:lang w:val="ru-RU"/>
+              </w:rPr>
+            </w:pPr>
+            <w:r>
+              <w:rPr>
+                <w:sz w:val="24"/>
+                <w:szCs w:val="20"/>
                 <w:lang w:val="ru-RU"/>
               </w:rPr>
               <w:t>JSON Web Token — токен аутентификации</w:t>
@@ -4919,11 +4863,15 @@
             <w:pPr>
               <w:ind w:firstLine="0"/>
               <w:rPr>
-                <w:lang w:val="ru-RU"/>
-              </w:rPr>
-            </w:pPr>
-            <w:r>
-              <w:rPr>
+                <w:sz w:val="24"/>
+                <w:szCs w:val="20"/>
+                <w:lang w:val="ru-RU"/>
+              </w:rPr>
+            </w:pPr>
+            <w:r>
+              <w:rPr>
+                <w:sz w:val="24"/>
+                <w:szCs w:val="20"/>
                 <w:lang w:val="ru-RU"/>
               </w:rPr>
               <w:t>LWW</w:t>
@@ -4953,11 +4901,15 @@
             <w:pPr>
               <w:ind w:firstLine="0"/>
               <w:rPr>
-                <w:lang w:val="ru-RU"/>
-              </w:rPr>
-            </w:pPr>
-            <w:r>
-              <w:rPr>
+                <w:sz w:val="24"/>
+                <w:szCs w:val="20"/>
+                <w:lang w:val="ru-RU"/>
+              </w:rPr>
+            </w:pPr>
+            <w:r>
+              <w:rPr>
+                <w:sz w:val="24"/>
+                <w:szCs w:val="20"/>
                 <w:lang w:val="ru-RU"/>
               </w:rPr>
               <w:t>Last-Write-Wins — стратегия разрешения конфликтов «последняя запись побеждает»</w:t>
@@ -4989,11 +4941,15 @@
             <w:pPr>
               <w:ind w:firstLine="0"/>
               <w:rPr>
-                <w:lang w:val="ru-RU"/>
-              </w:rPr>
-            </w:pPr>
-            <w:r>
-              <w:rPr>
+                <w:sz w:val="24"/>
+                <w:szCs w:val="20"/>
+                <w:lang w:val="ru-RU"/>
+              </w:rPr>
+            </w:pPr>
+            <w:r>
+              <w:rPr>
+                <w:sz w:val="24"/>
+                <w:szCs w:val="20"/>
                 <w:lang w:val="ru-RU"/>
               </w:rPr>
               <w:t>MAUI</w:t>
@@ -5023,11 +4979,15 @@
             <w:pPr>
               <w:ind w:firstLine="0"/>
               <w:rPr>
-                <w:lang w:val="ru-RU"/>
-              </w:rPr>
-            </w:pPr>
-            <w:r>
-              <w:rPr>
+                <w:sz w:val="24"/>
+                <w:szCs w:val="20"/>
+                <w:lang w:val="ru-RU"/>
+              </w:rPr>
+            </w:pPr>
+            <w:r>
+              <w:rPr>
+                <w:sz w:val="24"/>
+                <w:szCs w:val="20"/>
                 <w:lang w:val="ru-RU"/>
               </w:rPr>
               <w:t>.NET Multi-platform App UI — кроссплатформенный UI-фреймворк Microsoft</w:t>
@@ -5059,11 +5019,15 @@
             <w:pPr>
               <w:ind w:firstLine="0"/>
               <w:rPr>
-                <w:lang w:val="ru-RU"/>
-              </w:rPr>
-            </w:pPr>
-            <w:r>
-              <w:rPr>
+                <w:sz w:val="24"/>
+                <w:szCs w:val="20"/>
+                <w:lang w:val="ru-RU"/>
+              </w:rPr>
+            </w:pPr>
+            <w:r>
+              <w:rPr>
+                <w:sz w:val="24"/>
+                <w:szCs w:val="20"/>
                 <w:lang w:val="ru-RU"/>
               </w:rPr>
               <w:t>ML</w:t>
@@ -5093,11 +5057,15 @@
             <w:pPr>
               <w:ind w:firstLine="0"/>
               <w:rPr>
-                <w:lang w:val="ru-RU"/>
-              </w:rPr>
-            </w:pPr>
-            <w:r>
-              <w:rPr>
+                <w:sz w:val="24"/>
+                <w:szCs w:val="20"/>
+                <w:lang w:val="ru-RU"/>
+              </w:rPr>
+            </w:pPr>
+            <w:r>
+              <w:rPr>
+                <w:sz w:val="24"/>
+                <w:szCs w:val="20"/>
                 <w:lang w:val="ru-RU"/>
               </w:rPr>
               <w:t>Machine Learning — машинное обучение</w:t>
@@ -5129,11 +5097,15 @@
             <w:pPr>
               <w:ind w:firstLine="0"/>
               <w:rPr>
-                <w:lang w:val="ru-RU"/>
-              </w:rPr>
-            </w:pPr>
-            <w:r>
-              <w:rPr>
+                <w:sz w:val="24"/>
+                <w:szCs w:val="20"/>
+                <w:lang w:val="ru-RU"/>
+              </w:rPr>
+            </w:pPr>
+            <w:r>
+              <w:rPr>
+                <w:sz w:val="24"/>
+                <w:szCs w:val="20"/>
                 <w:lang w:val="ru-RU"/>
               </w:rPr>
               <w:t>MVVM</w:t>
@@ -5163,11 +5135,15 @@
             <w:pPr>
               <w:ind w:firstLine="0"/>
               <w:rPr>
-                <w:lang w:val="ru-RU"/>
-              </w:rPr>
-            </w:pPr>
-            <w:r>
-              <w:rPr>
+                <w:sz w:val="24"/>
+                <w:szCs w:val="20"/>
+                <w:lang w:val="ru-RU"/>
+              </w:rPr>
+            </w:pPr>
+            <w:r>
+              <w:rPr>
+                <w:sz w:val="24"/>
+                <w:szCs w:val="20"/>
                 <w:lang w:val="ru-RU"/>
               </w:rPr>
               <w:t>Model-View-ViewModel — архитектурный паттерн</w:t>
@@ -5199,11 +5175,15 @@
             <w:pPr>
               <w:ind w:firstLine="0"/>
               <w:rPr>
-                <w:lang w:val="ru-RU"/>
-              </w:rPr>
-            </w:pPr>
-            <w:r>
-              <w:rPr>
+                <w:sz w:val="24"/>
+                <w:szCs w:val="20"/>
+                <w:lang w:val="ru-RU"/>
+              </w:rPr>
+            </w:pPr>
+            <w:r>
+              <w:rPr>
+                <w:sz w:val="24"/>
+                <w:szCs w:val="20"/>
                 <w:lang w:val="ru-RU"/>
               </w:rPr>
               <w:t>ONNX</w:t>
@@ -5233,11 +5213,15 @@
             <w:pPr>
               <w:ind w:firstLine="0"/>
               <w:rPr>
-                <w:lang w:val="ru-RU"/>
-              </w:rPr>
-            </w:pPr>
-            <w:r>
-              <w:rPr>
+                <w:sz w:val="24"/>
+                <w:szCs w:val="20"/>
+                <w:lang w:val="ru-RU"/>
+              </w:rPr>
+            </w:pPr>
+            <w:r>
+              <w:rPr>
+                <w:sz w:val="24"/>
+                <w:szCs w:val="20"/>
                 <w:lang w:val="ru-RU"/>
               </w:rPr>
               <w:t>Open Neural Network Exchange — открытый формат моделей МО</w:t>
@@ -5269,11 +5253,15 @@
             <w:pPr>
               <w:ind w:firstLine="0"/>
               <w:rPr>
-                <w:lang w:val="ru-RU"/>
-              </w:rPr>
-            </w:pPr>
-            <w:r>
-              <w:rPr>
+                <w:sz w:val="24"/>
+                <w:szCs w:val="20"/>
+                <w:lang w:val="ru-RU"/>
+              </w:rPr>
+            </w:pPr>
+            <w:r>
+              <w:rPr>
+                <w:sz w:val="24"/>
+                <w:szCs w:val="20"/>
                 <w:lang w:val="ru-RU"/>
               </w:rPr>
               <w:t>RPE</w:t>
@@ -5303,11 +5291,15 @@
             <w:pPr>
               <w:ind w:firstLine="0"/>
               <w:rPr>
-                <w:lang w:val="ru-RU"/>
-              </w:rPr>
-            </w:pPr>
-            <w:r>
-              <w:rPr>
+                <w:sz w:val="24"/>
+                <w:szCs w:val="20"/>
+                <w:lang w:val="ru-RU"/>
+              </w:rPr>
+            </w:pPr>
+            <w:r>
+              <w:rPr>
+                <w:sz w:val="24"/>
+                <w:szCs w:val="20"/>
                 <w:lang w:val="ru-RU"/>
               </w:rPr>
               <w:t>Rate of Perceived Exertion — субъективная оценка интенсивности нагрузки</w:t>
@@ -5339,11 +5331,15 @@
             <w:pPr>
               <w:ind w:firstLine="0"/>
               <w:rPr>
-                <w:lang w:val="ru-RU"/>
-              </w:rPr>
-            </w:pPr>
-            <w:r>
-              <w:rPr>
+                <w:sz w:val="24"/>
+                <w:szCs w:val="20"/>
+                <w:lang w:val="ru-RU"/>
+              </w:rPr>
+            </w:pPr>
+            <w:r>
+              <w:rPr>
+                <w:sz w:val="24"/>
+                <w:szCs w:val="20"/>
                 <w:lang w:val="ru-RU"/>
               </w:rPr>
               <w:t>SQL</w:t>
@@ -5373,11 +5369,15 @@
             <w:pPr>
               <w:ind w:firstLine="0"/>
               <w:rPr>
-                <w:lang w:val="ru-RU"/>
-              </w:rPr>
-            </w:pPr>
-            <w:r>
-              <w:rPr>
+                <w:sz w:val="24"/>
+                <w:szCs w:val="20"/>
+                <w:lang w:val="ru-RU"/>
+              </w:rPr>
+            </w:pPr>
+            <w:r>
+              <w:rPr>
+                <w:sz w:val="24"/>
+                <w:szCs w:val="20"/>
                 <w:lang w:val="ru-RU"/>
               </w:rPr>
               <w:t>Structured Query Language — язык структурированных запросов</w:t>
@@ -5409,14 +5409,17 @@
             <w:pPr>
               <w:ind w:firstLine="0"/>
               <w:rPr>
-                <w:lang w:val="ru-RU"/>
-              </w:rPr>
-            </w:pPr>
-            <w:r>
-              <w:rPr>
-                <w:lang w:val="ru-RU"/>
-              </w:rPr>
-              <w:lastRenderedPageBreak/>
+                <w:sz w:val="24"/>
+                <w:szCs w:val="20"/>
+                <w:lang w:val="ru-RU"/>
+              </w:rPr>
+            </w:pPr>
+            <w:r>
+              <w:rPr>
+                <w:sz w:val="24"/>
+                <w:szCs w:val="20"/>
+                <w:lang w:val="ru-RU"/>
+              </w:rPr>
               <w:t>UI</w:t>
             </w:r>
           </w:p>
@@ -5444,11 +5447,15 @@
             <w:pPr>
               <w:ind w:firstLine="0"/>
               <w:rPr>
-                <w:lang w:val="ru-RU"/>
-              </w:rPr>
-            </w:pPr>
-            <w:r>
-              <w:rPr>
+                <w:sz w:val="24"/>
+                <w:szCs w:val="20"/>
+                <w:lang w:val="ru-RU"/>
+              </w:rPr>
+            </w:pPr>
+            <w:r>
+              <w:rPr>
+                <w:sz w:val="24"/>
+                <w:szCs w:val="20"/>
                 <w:lang w:val="ru-RU"/>
               </w:rPr>
               <w:t>User Interface — пользовательский интерфейс</w:t>
@@ -5847,93 +5854,72 @@
     </w:p>
     <w:p>
       <w:pPr>
-        <w:rPr>
-          <w:lang w:val="ru-RU"/>
-        </w:rPr>
-      </w:pPr>
-      <w:r>
-        <w:rPr>
-          <w:lang w:val="ru-RU"/>
-        </w:rPr>
-        <w:t>Силовой тренинг представляет собой вид физической активности, направленный на развитие мышечной силы, гипертрофии и общей физической подготовленности посредством выполнения упражнений с сопротивлением — штангой, гантелями, тренажёрами или собственным весом тела. Систематический силовой тренинг является научно обоснованным средством улучшения состояния опорно-двигательного аппарата, метаболических показателей и качества жизни [4].</w:t>
-      </w:r>
-    </w:p>
-    <w:p>
-      <w:pPr>
-        <w:rPr>
-          <w:lang w:val="ru-RU"/>
-        </w:rPr>
-      </w:pPr>
-      <w:r>
-        <w:rPr>
-          <w:lang w:val="ru-RU"/>
-        </w:rPr>
-        <w:t xml:space="preserve">Структура тренировочного процесса. </w:t>
-      </w:r>
-      <w:r>
-        <w:rPr>
-          <w:lang w:val="ru-RU"/>
-        </w:rPr>
-        <w:t>Тренировка состоит из набора упражнений, каждое из которых включает один или несколько подходов.</w:t>
-      </w:r>
-      <w:r>
-        <w:rPr>
-          <w:lang w:val="ru-RU"/>
-        </w:rPr>
+        <w:pStyle w:val="af3"/>
+      </w:pPr>
+      <w:r>
+        <w:t>Силовой тренинг представляет собой вид физической активности, при котором мышцы преодолевают внешнее сопротивление: вес штанги, гантелей, тренажёров или собственного тела. Его целью служит увеличение мышечной силы и массы (гипертрофия), а также повышение общей физической подготовленности. Систематические занятия силовыми упражнениями научно признаны действенным средством укрепления опорно-двигательного аппарата, нормализации обмена веществ и повышения качества жизни [4].</w:t>
+      </w:r>
+    </w:p>
+    <w:p>
+      <w:pPr>
+        <w:pStyle w:val="af3"/>
+      </w:pPr>
+      <w:r>
+        <w:t>Тренировочный процесс имеет иерархическую структуру: отдельная тренировка складывается из упражнений, а каждое упражнение — из одного или нескольких подходов. Подход описывается тремя основными параметрами: рабочим весом (кг), числом повторений и субъективной оценкой воспринимаемой нагрузки RPE (Rate of Perceived Exertion) по шкале Борга [5]. Эта шкала принимает значения от 1 до 10: оценка 10 отвечает мышечному отказу, а диапазон 7–8 — умеренно тяжёлой нагрузке, рекомендуемой для большинства рабочих подходов.</w:t>
+      </w:r>
+      <w:r>
         <w:t xml:space="preserve"> </w:t>
       </w:r>
       <w:r>
         <w:rPr>
-          <w:lang w:val="ru-RU"/>
-        </w:rPr>
-        <w:t xml:space="preserve">Подход характеризуется тремя основными параметрами: рабочим весом (кг), числом </w:t>
-      </w:r>
-      <w:r>
-        <w:rPr>
-          <w:highlight w:val="green"/>
-          <w:lang w:val="ru-RU"/>
-        </w:rPr>
-        <w:t>повторений</w:t>
-      </w:r>
-      <w:r>
-        <w:rPr>
-          <w:lang w:val="ru-RU"/>
-        </w:rPr>
-        <w:t xml:space="preserve"> и субъективной оценкой воспринимаемой нагрузки — RPE (Rate of Perceived Exertion) по шкале Борга [5]. Шкала RPE варьируется от 1 до 10, где значение 10 соответствует отказу, а значение 7–8 — умеренно тяжёлой нагрузке, рекомендуемой для большинства рабочих подходов.</w:t>
-      </w:r>
-    </w:p>
-    <w:p>
-      <w:pPr>
-        <w:rPr>
-          <w:lang w:val="ru-RU"/>
-        </w:rPr>
-      </w:pPr>
-      <w:r>
-        <w:rPr>
-          <w:lang w:val="ru-RU"/>
-        </w:rPr>
-        <w:t xml:space="preserve">Одноповторный максимум (1ПМ, one-rep max, 1RM) — стандартная единица оценки силовой подготовленности в пауэрлифтинге и бодибилдинге. Прямое измерение 1ПМ сопряжено с риском травмы, поэтому на практике широко применяются косвенные формулы оценки. Наиболее распространённой является </w:t>
-      </w:r>
-      <w:r>
-        <w:rPr>
-          <w:highlight w:val="green"/>
-          <w:lang w:val="ru-RU"/>
-        </w:rPr>
-        <w:t>формула Эпли</w:t>
-      </w:r>
-      <w:r>
-        <w:rPr>
-          <w:highlight w:val="green"/>
-          <w:lang w:val="ru-RU"/>
-        </w:rPr>
-        <w:t xml:space="preserve">(1.1) </w:t>
-      </w:r>
-      <w:r>
-        <w:rPr>
-          <w:highlight w:val="green"/>
-          <w:lang w:val="ru-RU"/>
-        </w:rPr>
-        <w:t>[6]:</w:t>
+          <w:rStyle w:val="af4"/>
+        </w:rPr>
+        <w:t>Более низкие значения RPE (6 и менее) соответствуют легкой или разминочной нагрузке, а также подходам, выполняемым в рамках скоростно-силовой работы или фазы разгрузки (делоада), когда сознательно сохраняется значительный запас повторений до отказа для минимизации утомления ЦНС</w:t>
+      </w:r>
+    </w:p>
+    <w:p>
+      <w:pPr>
+        <w:pStyle w:val="af3"/>
+      </w:pPr>
+      <w:r>
+        <w:t>Одноповторный максимум</w:t>
+      </w:r>
+      <w:r>
+        <w:t xml:space="preserve"> </w:t>
+      </w:r>
+      <w:r>
+        <w:t>— предельный вес, который атлет способен поднять в одном повторении</w:t>
+      </w:r>
+      <w:r>
+        <w:t>. О</w:t>
+      </w:r>
+      <w:r>
+        <w:t xml:space="preserve">н служит основной мерой силовой подготовленности в пауэрлифтинге и бодибилдинге. Поскольку прямое измерение </w:t>
+      </w:r>
+      <w:r>
+        <w:t>одноповторного максимума</w:t>
+      </w:r>
+      <w:r>
+        <w:t xml:space="preserve"> сопряжено с риском травмы, на практике его оценивают косвенно — по результату подхода с субмаксимальным весом.</w:t>
+      </w:r>
+      <w:r>
+        <w:t xml:space="preserve"> </w:t>
+      </w:r>
+      <w:r>
+        <w:t xml:space="preserve">В качестве расчетного инструмента применяется </w:t>
+      </w:r>
+      <w:r>
+        <w:lastRenderedPageBreak/>
+        <w:t>аппроксимирующее уравнение, разработанное ученым Б. Эпли</w:t>
+      </w:r>
+      <w:r>
+        <w:t>[6]</w:t>
+      </w:r>
+      <w:r>
+        <w:t>, расчет по которому производится по формуле</w:t>
+      </w:r>
+      <w:r>
+        <w:t>(1.1).</w:t>
       </w:r>
     </w:p>
     <w:tbl>
@@ -6109,27 +6095,23 @@
     <w:p>
       <w:pPr>
         <w:rPr>
-          <w:highlight w:val="green"/>
-          <w:lang w:val="ru-RU"/>
-        </w:rPr>
-      </w:pPr>
-      <w:r>
-        <w:rPr>
-          <w:highlight w:val="green"/>
+          <w:lang w:val="ru-RU"/>
+        </w:rPr>
+      </w:pPr>
+      <w:r>
+        <w:rPr>
           <w:lang w:val="ru-RU"/>
         </w:rPr>
         <w:t>г</w:t>
       </w:r>
       <w:r>
         <w:rPr>
-          <w:highlight w:val="green"/>
           <w:lang w:val="ru-RU"/>
         </w:rPr>
         <w:t>де</w:t>
       </w:r>
       <w:r>
         <w:rPr>
-          <w:highlight w:val="green"/>
           <w:lang w:val="ru-RU"/>
         </w:rPr>
         <w:t>:</w:t>
@@ -6143,7 +6125,6 @@
           <w:numId w:val="17"/>
         </w:numPr>
         <w:rPr>
-          <w:highlight w:val="green"/>
           <w:lang w:val="ru-RU"/>
         </w:rPr>
       </w:pPr>
@@ -6151,7 +6132,6 @@
         <m:r>
           <w:rPr>
             <w:rFonts w:ascii="Cambria Math" w:hAnsi="Cambria Math"/>
-            <w:highlight w:val="green"/>
             <w:lang w:val="ru-RU"/>
           </w:rPr>
           <m:t>W</m:t>
@@ -6159,14 +6139,12 @@
       </m:oMath>
       <w:r>
         <w:rPr>
-          <w:highlight w:val="green"/>
           <w:lang w:val="ru-RU"/>
         </w:rPr>
         <w:t xml:space="preserve"> — рабочий вес подхода (кг)</w:t>
       </w:r>
       <w:r>
         <w:rPr>
-          <w:highlight w:val="green"/>
           <w:lang w:val="ru-RU"/>
         </w:rPr>
         <w:t>;</w:t>
@@ -6180,7 +6158,6 @@
           <w:numId w:val="17"/>
         </w:numPr>
         <w:rPr>
-          <w:highlight w:val="green"/>
           <w:lang w:val="ru-RU"/>
         </w:rPr>
       </w:pPr>
@@ -6188,7 +6165,6 @@
         <m:r>
           <w:rPr>
             <w:rFonts w:ascii="Cambria Math" w:hAnsi="Cambria Math"/>
-            <w:highlight w:val="green"/>
             <w:lang w:val="ru-RU"/>
           </w:rPr>
           <m:t>N</m:t>
@@ -6196,7 +6172,6 @@
       </m:oMath>
       <w:r>
         <w:rPr>
-          <w:highlight w:val="green"/>
           <w:lang w:val="ru-RU"/>
         </w:rPr>
         <w:t xml:space="preserve"> — число выполненных повторений.</w:t>
@@ -6204,79 +6179,53 @@
     </w:p>
     <w:p>
       <w:pPr>
-        <w:rPr>
-          <w:lang w:val="ru-RU"/>
-        </w:rPr>
-      </w:pPr>
-      <w:r>
-        <w:rPr>
-          <w:lang w:val="ru-RU"/>
-        </w:rPr>
-        <w:t xml:space="preserve"> Формула применяется к самому тяжёлому рабочему подходу тренировки и даёт оценку 1ПМ с погрешностью около 5% [7]. Аналогичные </w:t>
-      </w:r>
-      <w:r>
-        <w:rPr>
-          <w:lang w:val="ru-RU"/>
-        </w:rPr>
-        <w:lastRenderedPageBreak/>
-        <w:t>формулы предложены Бжицким [8] и Лэндером [9]; формула Эпли выбрана в настоящей работе ввиду наибольшей распространённости и простоты реализации.</w:t>
-      </w:r>
-    </w:p>
-    <w:p>
-      <w:pPr>
-        <w:rPr>
-          <w:lang w:val="ru-RU"/>
-        </w:rPr>
-      </w:pPr>
-      <w:r>
-        <w:rPr>
-          <w:lang w:val="ru-RU"/>
-        </w:rPr>
-        <w:t>Прогрессивная нагрузка</w:t>
-      </w:r>
-      <w:r>
-        <w:rPr>
-          <w:lang w:val="ru-RU"/>
-        </w:rPr>
+        <w:pStyle w:val="af3"/>
+      </w:pPr>
+      <w:r>
+        <w:t>Эту о</w:t>
+      </w:r>
+      <w:r>
+        <w:t>ценку получают по наиболее тяжёлому рабочему подходу тренировки; по данным сопоставительных исследований, её погрешность не превышает примерно 5 % [7]. Близкие по назначению зависимости предложены Бжицким [8] и Лэндером [9]. В настоящей работе принята формула Эпли как наиболее распространённая и простая в реализации.</w:t>
+      </w:r>
+    </w:p>
+    <w:p>
+      <w:pPr>
+        <w:pStyle w:val="af3"/>
+      </w:pPr>
+      <w:r>
+        <w:t xml:space="preserve">Принцип прогрессивной нагрузки лежит в основе силового тренинга и состоит в систематическом повышении тренировочного воздействия, побуждающего организм к адаптации [10]. На практике нагрузку наращивают, увеличивая рабочий вес, число повторений либо число подходов. Темп прироста нелинеен и убывает со стажем: у начинающих атлетов </w:t>
+      </w:r>
+      <w:r>
+        <w:t>одноповторный максимум</w:t>
+      </w:r>
+      <w:r>
+        <w:t xml:space="preserve"> за 26 недель возрастает на 17–22 %, тогда как у опытных </w:t>
+      </w:r>
+      <w:r>
+        <w:t xml:space="preserve">спортсменов со </w:t>
+      </w:r>
+      <w:r>
+        <w:t>стаж</w:t>
+      </w:r>
+      <w:r>
+        <w:t>ем</w:t>
+      </w:r>
+      <w:r>
+        <w:t xml:space="preserve"> свыше трёх лет — лишь на 3–6 % [11].</w:t>
+      </w:r>
+    </w:p>
+    <w:p>
+      <w:pPr>
+        <w:pStyle w:val="af3"/>
+      </w:pPr>
+      <w:r>
+        <w:t>Программа тренировок задаёт распределение нагрузки по мышечным группам в пределах недельного цикла. Разрабатываемая система поддерживает типовые схемы: проработку всего тела за одно занятие (Full Body, 2–3 занятия в неделю), раздельное чередование жимовых, тяговых движений и упражнений на ноги (Push-Pull-Legs, 3–5 занятий), а также разделение</w:t>
+      </w:r>
+      <w:r>
         <w:t xml:space="preserve"> </w:t>
       </w:r>
       <w:r>
-        <w:rPr>
-          <w:lang w:val="ru-RU"/>
-        </w:rPr>
-        <w:t xml:space="preserve">— основной принцип силового тренинга, заключающийся в систематическом увеличении тренировочного стресса для стимуляции адаптации организма [10]. Практически прогрессия реализуется через увеличение рабочего веса, числа повторений или числа подходов. Скорость прогресса нелинейна: у начинающих атлетов прирост 1ПМ за 26 недель может составить 17–22%, тогда как у опытных </w:t>
-      </w:r>
-      <w:r>
-        <w:rPr>
-          <w:lang w:val="ru-RU"/>
-        </w:rPr>
-        <w:t xml:space="preserve">со </w:t>
-      </w:r>
-      <w:r>
-        <w:rPr>
-          <w:lang w:val="ru-RU"/>
-        </w:rPr>
-        <w:t>стаж</w:t>
-      </w:r>
-      <w:r>
-        <w:rPr>
-          <w:lang w:val="ru-RU"/>
-        </w:rPr>
-        <w:t xml:space="preserve">ем </w:t>
-      </w:r>
-      <w:r>
-        <w:rPr>
-          <w:lang w:val="ru-RU"/>
-        </w:rPr>
-        <w:t>более 3 лет — лишь 3–6% [11].</w:t>
-      </w:r>
-    </w:p>
-    <w:p>
-      <w:pPr>
-        <w:pStyle w:val="af3"/>
-      </w:pPr>
-      <w:r>
-        <w:t>Программа тренировок определяет распределение нагрузки на мышечные группы по дням недели. В разрабатываемой системе поддерживаются следующие типовые схемы: проработка всего тела (Full Body, 2–3 дня/нед.), чередование тяговых, жимовых движений и упражнений на ноги (Push-Pull-Legs, 3–5 дней/нед.), а также раздельные тренировки верхней и нижней частей тела (Upper-Lower, 4 дня/нед.).</w:t>
+        <w:t>нагрузки на верхнюю и нижнюю части тела (Upper-Lower, 4 занятия).</w:t>
       </w:r>
     </w:p>
     <w:p>
@@ -6295,13 +6244,21 @@
           <w:rStyle w:val="af1"/>
           <w:b w:val="0"/>
           <w:bCs w:val="0"/>
-        </w:rPr>
-      </w:pPr>
-      <w:r>
-        <w:rPr>
-          <w:lang w:val="ru-RU"/>
-        </w:rPr>
-        <w:t>На рынке мобильных приложений для учёта силовых тренировок представлено несколько решений. Проведён сравнительный анализ четырёх наиболее популярных приложений по ключевым критериям, значимым для целевой аудитории</w:t>
+          <w:lang w:val="ru-RU"/>
+        </w:rPr>
+      </w:pPr>
+      <w:r>
+        <w:rPr>
+          <w:lang w:val="ru-RU"/>
+        </w:rPr>
+        <w:t xml:space="preserve">На рынке мобильных приложений для учёта силовых тренировок представлено несколько решений. Проведён сравнительный анализ четырёх </w:t>
+      </w:r>
+      <w:r>
+        <w:rPr>
+          <w:lang w:val="ru-RU"/>
+        </w:rPr>
+        <w:lastRenderedPageBreak/>
+        <w:t>наиболее популярных приложений по ключевым критериям, значимым для целевой аудитории</w:t>
       </w:r>
       <w:r>
         <w:rPr>
@@ -6899,43 +6856,6 @@
           </w:p>
         </w:tc>
       </w:tr>
-    </w:tbl>
-    <w:p>
-      <w:r>
-        <w:br w:type="page"/>
-      </w:r>
-    </w:p>
-    <w:p>
-      <w:pPr>
-        <w:ind w:firstLine="0"/>
-        <w:rPr>
-          <w:lang w:val="ru-RU"/>
-        </w:rPr>
-      </w:pPr>
-      <w:r>
-        <w:rPr>
-          <w:lang w:val="ru-RU"/>
-        </w:rPr>
-        <w:lastRenderedPageBreak/>
-        <w:t>Продолжение таблицы 1</w:t>
-      </w:r>
-    </w:p>
-    <w:tbl>
-      <w:tblPr>
-        <w:tblStyle w:val="aa"/>
-        <w:tblW w:w="9209" w:type="dxa"/>
-        <w:jc w:val="center"/>
-        <w:tblLayout w:type="fixed"/>
-        <w:tblLook w:val="04A0" w:firstRow="1" w:lastRow="0" w:firstColumn="1" w:lastColumn="0" w:noHBand="0" w:noVBand="1"/>
-      </w:tblPr>
-      <w:tblGrid>
-        <w:gridCol w:w="1765"/>
-        <w:gridCol w:w="1473"/>
-        <w:gridCol w:w="1435"/>
-        <w:gridCol w:w="1615"/>
-        <w:gridCol w:w="1220"/>
-        <w:gridCol w:w="1701"/>
-      </w:tblGrid>
       <w:tr>
         <w:trPr>
           <w:trHeight w:val="29"/>
@@ -8410,6 +8330,7 @@
         <w:rPr>
           <w:lang w:val="ru-RU"/>
         </w:rPr>
+        <w:lastRenderedPageBreak/>
         <w:t>FitNotes — простое Android-приложение с открытым исходным кодом, специализированное на учёте силовых тренировок. Поддерживает графики прогресса и экспорт CSV. Отсутствует облачная синхронизация, ML-функции и поддержка iOS/Windows.</w:t>
       </w:r>
     </w:p>
@@ -8470,7 +8391,6 @@
           <w:highlight w:val="yellow"/>
           <w:lang w:val="ru-RU"/>
         </w:rPr>
-        <w:lastRenderedPageBreak/>
         <w:t>персонализированное ML-прогнозирование 1ПМ, работающее локально на устройстве без подписк</w:t>
       </w:r>
       <w:r>
@@ -8633,14 +8553,7 @@
           <w:highlight w:val="green"/>
           <w:lang w:val="ru-RU"/>
         </w:rPr>
-        <w:t>одноповторный максимум</w:t>
-      </w:r>
-      <w:r>
-        <w:rPr>
-          <w:highlight w:val="green"/>
-          <w:lang w:val="ru-RU"/>
-        </w:rPr>
-        <w:t>;</w:t>
+        <w:t>одноповторный максимум;</w:t>
       </w:r>
     </w:p>
     <w:p>
@@ -8689,6 +8602,7 @@
         <w:rPr>
           <w:lang w:val="ru-RU"/>
         </w:rPr>
+        <w:lastRenderedPageBreak/>
         <w:t>автоматическая генерация рекомендации по нагрузке на следующую тренировку;</w:t>
       </w:r>
     </w:p>
@@ -8756,7 +8670,6 @@
         <w:rPr>
           <w:lang w:val="ru-RU"/>
         </w:rPr>
-        <w:lastRenderedPageBreak/>
         <w:t>кроссплатформенность: Android (API 30+) и W</w:t>
       </w:r>
       <w:r>
@@ -9025,7 +8938,14 @@
         <w:rPr>
           <w:lang w:val="ru-RU"/>
         </w:rPr>
-        <w:t xml:space="preserve">Методы градиентного бустинга демонстрируют высокую точность при решении задач регрессии на структурированных данных с большим числом признаков [3]. </w:t>
+        <w:t xml:space="preserve">Методы градиентного бустинга демонстрируют высокую точность при решении задач регрессии на структурированных данных с большим числом </w:t>
+      </w:r>
+      <w:r>
+        <w:rPr>
+          <w:lang w:val="ru-RU"/>
+        </w:rPr>
+        <w:lastRenderedPageBreak/>
+        <w:t xml:space="preserve">признаков [3]. </w:t>
       </w:r>
       <w:r>
         <w:rPr>
@@ -9079,7 +8999,6 @@
         <w:rPr>
           <w:lang w:val="ru-RU"/>
         </w:rPr>
-        <w:lastRenderedPageBreak/>
         <w:t>Нейросетевые методы (LSTM, трансформеры) теоретически могут моделировать долгосрочные зависимости в тренировочных сериях, однако требуют значительно большего объёма данных и вычислительных ресурсов для обучения, что затрудняет их применение в условиях ограниченных размеченных датасетов [1</w:t>
       </w:r>
       <w:r>
@@ -9929,6 +9848,11 @@
       <w:bookmarkEnd w:id="11"/>
     </w:p>
     <w:p>
+      <w:pPr>
+        <w:rPr>
+          <w:lang w:val="ru-RU"/>
+        </w:rPr>
+      </w:pPr>
       <w:r>
         <w:rPr>
           <w:lang w:val="ru-RU"/>
@@ -9945,6 +9869,9 @@
     <w:p>
       <w:pPr>
         <w:ind w:firstLine="0"/>
+        <w:rPr>
+          <w:lang w:val="ru-RU"/>
+        </w:rPr>
       </w:pPr>
       <w:r>
         <w:rPr>
@@ -9953,6 +9880,9 @@
         <w:t>Таблица</w:t>
       </w:r>
       <w:r>
+        <w:rPr>
+          <w:lang w:val="ru-RU"/>
+        </w:rPr>
         <w:t xml:space="preserve"> 2 — </w:t>
       </w:r>
       <w:r>
@@ -9962,7 +9892,19 @@
         <w:t>Эндпоинты</w:t>
       </w:r>
       <w:r>
-        <w:t xml:space="preserve"> API </w:t>
+        <w:rPr>
+          <w:lang w:val="ru-RU"/>
+        </w:rPr>
+        <w:t xml:space="preserve"> </w:t>
+      </w:r>
+      <w:r>
+        <w:t>API</w:t>
+      </w:r>
+      <w:r>
+        <w:rPr>
+          <w:lang w:val="ru-RU"/>
+        </w:rPr>
+        <w:t xml:space="preserve"> </w:t>
       </w:r>
       <w:r>
         <w:rPr>
@@ -9971,7 +9913,19 @@
         <w:t>сервера</w:t>
       </w:r>
       <w:r>
-        <w:t xml:space="preserve"> FitApp.</w:t>
+        <w:rPr>
+          <w:lang w:val="ru-RU"/>
+        </w:rPr>
+        <w:t xml:space="preserve"> </w:t>
+      </w:r>
+      <w:r>
+        <w:t>FitApp</w:t>
+      </w:r>
+      <w:r>
+        <w:rPr>
+          <w:lang w:val="ru-RU"/>
+        </w:rPr>
+        <w:t>.</w:t>
       </w:r>
     </w:p>
     <w:tbl>
@@ -10017,7 +9971,7 @@
             <w:pPr>
               <w:spacing w:line="240" w:lineRule="auto"/>
               <w:ind w:firstLine="0"/>
-              <w:jc w:val="center"/>
+              <w:jc w:val="left"/>
               <w:rPr>
                 <w:rFonts w:eastAsia="Times New Roman" w:cs="Times New Roman"/>
                 <w:b/>
@@ -10203,7 +10157,7 @@
             <w:pPr>
               <w:spacing w:line="240" w:lineRule="auto"/>
               <w:ind w:firstLine="0"/>
-              <w:jc w:val="center"/>
+              <w:jc w:val="left"/>
               <w:rPr>
                 <w:rFonts w:eastAsia="Times New Roman" w:cs="Times New Roman"/>
                 <w:sz w:val="24"/>
@@ -10375,7 +10329,7 @@
             <w:pPr>
               <w:spacing w:line="240" w:lineRule="auto"/>
               <w:ind w:firstLine="0"/>
-              <w:jc w:val="center"/>
+              <w:jc w:val="left"/>
               <w:rPr>
                 <w:rFonts w:eastAsia="Times New Roman" w:cs="Times New Roman"/>
                 <w:sz w:val="24"/>
@@ -10550,7 +10504,7 @@
             <w:pPr>
               <w:spacing w:line="240" w:lineRule="auto"/>
               <w:ind w:firstLine="0"/>
-              <w:jc w:val="center"/>
+              <w:jc w:val="left"/>
               <w:rPr>
                 <w:rFonts w:eastAsia="Times New Roman" w:cs="Times New Roman"/>
                 <w:sz w:val="24"/>
@@ -12272,6 +12226,11 @@
       </w:r>
     </w:p>
     <w:p>
+      <w:pPr>
+        <w:rPr>
+          <w:lang w:val="ru-RU"/>
+        </w:rPr>
+      </w:pPr>
       <w:r>
         <w:rPr>
           <w:lang w:val="ru-RU"/>
@@ -12409,7 +12368,13 @@
         </w:tc>
       </w:tr>
     </w:tbl>
-    <w:p/>
+    <w:p>
+      <w:pPr>
+        <w:rPr>
+          <w:lang w:val="ru-RU"/>
+        </w:rPr>
+      </w:pPr>
+    </w:p>
     <w:p>
       <m:oMathPara>
         <m:oMath>
@@ -21292,14 +21257,14 @@
           <w:numId w:val="11"/>
         </w:numPr>
         <w:rPr>
-          <w:lang w:val="en-US" w:eastAsia="ru-RU"/>
-        </w:rPr>
-      </w:pPr>
-      <w:r>
-        <w:rPr>
-          <w:lang w:val="en-US" w:eastAsia="ru-RU"/>
-        </w:rPr>
-        <w:t>Westcott W. L. Resistance training is medicine: effects of strength training on health // Current Sports Medicine Reports. — 2012. — Vol. 11, No. 4. — P. 209–216.</w:t>
+          <w:lang w:eastAsia="ru-RU"/>
+        </w:rPr>
+      </w:pPr>
+      <w:r>
+        <w:rPr>
+          <w:lang w:eastAsia="ru-RU"/>
+        </w:rPr>
+        <w:t>Евсеев Ю. И. Физическая культура : учебное пособие. — 9-е изд. — Ростов н/Д : Феникс, 2014. — 444 с.</w:t>
       </w:r>
     </w:p>
     <w:p>
@@ -24847,7 +24812,7 @@
   <w:abstractNum w:abstractNumId="7" w15:restartNumberingAfterBreak="0">
     <w:nsid w:val="3AA9220A"/>
     <w:multiLevelType w:val="hybridMultilevel"/>
-    <w:tmpl w:val="DEDE7814"/>
+    <w:tmpl w:val="1FC29532"/>
     <w:lvl w:ilvl="0" w:tplc="0419000F">
       <w:start w:val="1"/>
       <w:numFmt w:val="decimal"/>

</xml_diff>